<commit_message>
Rebuild PDF/Word with logo & correct phone; redesign presentation as inline slide deck
- Rebuilt PioneerOutsourcing_KnowledgeBase.pdf: logo on every page header/footer,
  correct phone +254 111 562 567, professional cover page, section divider pages,
  alternating key-value rows, pricing tiers, onboarding steps, FAQ styling
- Rebuilt PioneerOutsourcing_KnowledgeBase.docx: updated phone +254 111 562 567
- knowledge-base.html: PDF tab now uses Google Docs Viewer (reliable on GitHub Pages);
  Presentation tab replaced with fully inline 10-slide deck (no iframe) with
  dark navy/gold branding, logo on every slide, arrow key/touch navigation,
  fullscreen support, smooth CSS transitions, cover stats, service grid,
  pricing tiers, onboarding timeline, SLA bars, contact slide

Co-Authored-By: Claude Sonnet 4.6 <noreply@anthropic.com>
</commit_message>
<xml_diff>
--- a/PioneerOutsourcing_KnowledgeBase.docx
+++ b/PioneerOutsourcing_KnowledgeBase.docx
@@ -100,7 +100,7 @@
           <w:sz w:val="20"/>
           <w:szCs w:val="20"/>
         </w:rPr>
-        <w:t xml:space="preserve">hello@pioneeroutsourcingbpo.com  |  WhatsApp: +254793008677</w:t>
+        <w:t xml:space="preserve">hello@pioneeroutsourcingbpo.com  |  WhatsApp: +254 111 562 567</w:t>
       </w:r>
     </w:p>
     <w:p>
@@ -175,7 +175,7 @@
           <w:sz w:val="22"/>
           <w:szCs w:val="22"/>
         </w:rPr>
-        <w:t xml:space="preserve">We serve clients across the USA, UK, Europe, Australia, Canada, and global markets, helping them dramatically reduce operational costs while maintaining — and often exceeding — the quality standards of their home markets. Today we are proud to support 200+ businesses globally with a team of 150+ skilled professionals operating 24 hours a day, 7 days a week, 365 days a year.</w:t>
+        <w:t xml:space="preserve">We serve clients across the USA, UK, Europe, Australia, Canada, and global markets, helping them dramatically reduce operational costs while maintaining â€” and often exceeding â€” the quality standards of their home markets. Today we are proud to support 200+ businesses globally with a team of 150+ skilled professionals operating 24 hours a day, 7 days a week, 365 days a year.</w:t>
       </w:r>
     </w:p>
     <w:p>
@@ -498,7 +498,7 @@
                 <w:sz w:val="20"/>
                 <w:szCs w:val="20"/>
               </w:rPr>
-              <w:t xml:space="preserve">+254793008677</w:t>
+              <w:t xml:space="preserve">+254 111 562 567</w:t>
             </w:r>
           </w:p>
         </w:tc>
@@ -948,7 +948,7 @@
           <w:sz w:val="22"/>
           <w:szCs w:val="22"/>
         </w:rPr>
-        <w:t xml:space="preserve">What began as a small, focused team has grown into a full-service BPO powerhouse. Our journey has been driven by one consistent philosophy: treat every client's business as if it were our own. We do not just provide agents — we provide dedicated partners who are invested in your success.</w:t>
+        <w:t xml:space="preserve">What began as a small, focused team has grown into a full-service BPO powerhouse. Our journey has been driven by one consistent philosophy: treat every client's business as if it were our own. We do not just provide agents â€” we provide dedicated partners who are invested in your success.</w:t>
       </w:r>
     </w:p>
     <w:p>
@@ -1032,7 +1032,7 @@
           <w:sz w:val="22"/>
           <w:szCs w:val="22"/>
         </w:rPr>
-        <w:t xml:space="preserve">To be Africa's most trusted and recognised BPO partner — known globally for excellence, innovation, reliability, and our unwavering commitment to transforming businesses and lives through strategic outsourcing.</w:t>
+        <w:t xml:space="preserve">To be Africa's most trusted and recognised BPO partner â€” known globally for excellence, innovation, reliability, and our unwavering commitment to transforming businesses and lives through strategic outsourcing.</w:t>
       </w:r>
     </w:p>
     <w:p>
@@ -1119,7 +1119,7 @@
           <w:sz w:val="22"/>
           <w:szCs w:val="22"/>
         </w:rPr>
-        <w:t xml:space="preserve">We succeed as one team — with each other and in genuine partnership with our clients.</w:t>
+        <w:t xml:space="preserve">We succeed as one team â€” with each other and in genuine partnership with our clients.</w:t>
       </w:r>
     </w:p>
     <w:p>
@@ -1391,7 +1391,7 @@
                 <w:sz w:val="20"/>
                 <w:szCs w:val="20"/>
               </w:rPr>
-              <w:t xml:space="preserve">Client satisfaction rate — consistently maintained</w:t>
+              <w:t xml:space="preserve">Client satisfaction rate â€” consistently maintained</w:t>
             </w:r>
           </w:p>
         </w:tc>
@@ -2873,7 +2873,7 @@
           <w:sz w:val="22"/>
           <w:szCs w:val="22"/>
         </w:rPr>
-        <w:t xml:space="preserve">Tier 1 — Basic Support: </w:t>
+        <w:t xml:space="preserve">Tier 1 â€” Basic Support: </w:t>
       </w:r>
       <w:r>
         <w:rPr>
@@ -2894,7 +2894,7 @@
           <w:sz w:val="22"/>
           <w:szCs w:val="22"/>
         </w:rPr>
-        <w:t xml:space="preserve">Tier 2 — Advanced Support: </w:t>
+        <w:t xml:space="preserve">Tier 2 â€” Advanced Support: </w:t>
       </w:r>
       <w:r>
         <w:rPr>
@@ -2915,7 +2915,7 @@
           <w:sz w:val="22"/>
           <w:szCs w:val="22"/>
         </w:rPr>
-        <w:t xml:space="preserve">Tier 3 — Expert Support: </w:t>
+        <w:t xml:space="preserve">Tier 3 â€” Expert Support: </w:t>
       </w:r>
       <w:r>
         <w:rPr>
@@ -3152,7 +3152,7 @@
           <w:sz w:val="22"/>
           <w:szCs w:val="22"/>
         </w:rPr>
-        <w:t xml:space="preserve">We handle the administrative and operational tasks that keep your business running — freeing your core team to focus on growth, strategy, and revenue.</w:t>
+        <w:t xml:space="preserve">We handle the administrative and operational tasks that keep your business running â€” freeing your core team to focus on growth, strategy, and revenue.</w:t>
       </w:r>
     </w:p>
     <w:p>
@@ -3261,7 +3261,7 @@
           <w:sz w:val="22"/>
           <w:szCs w:val="22"/>
         </w:rPr>
-        <w:t xml:space="preserve">HR administration — onboarding paperwork, leave tracking</w:t>
+        <w:t xml:space="preserve">HR administration â€” onboarding paperwork, leave tracking</w:t>
       </w:r>
     </w:p>
     <w:p>
@@ -3508,7 +3508,7 @@
           <w:sz w:val="22"/>
           <w:szCs w:val="22"/>
         </w:rPr>
-        <w:t xml:space="preserve">Appointment setting — booked directly into your sales calendar</w:t>
+        <w:t xml:space="preserve">Appointment setting â€” booked directly into your sales calendar</w:t>
       </w:r>
     </w:p>
     <w:p>
@@ -3704,143 +3704,143 @@
           <w:sz w:val="22"/>
           <w:szCs w:val="22"/>
         </w:rPr>
-        <w:t xml:space="preserve">Voice — inbound and outbound telephone support</w:t>
-      </w:r>
-    </w:p>
-    <w:p>
-      <w:pPr>
-        <w:pStyle w:val="ListParagraph"/>
-        <w:numPr>
-          <w:ilvl w:val="0"/>
-          <w:numId w:val="2"/>
-        </w:numPr>
-        <w:spacing w:after="80"/>
-      </w:pPr>
-      <w:r>
-        <w:rPr>
-          <w:sz w:val="22"/>
-          <w:szCs w:val="22"/>
-        </w:rPr>
-        <w:t xml:space="preserve">Email — inbox management and branded response handling</w:t>
-      </w:r>
-    </w:p>
-    <w:p>
-      <w:pPr>
-        <w:pStyle w:val="ListParagraph"/>
-        <w:numPr>
-          <w:ilvl w:val="0"/>
-          <w:numId w:val="2"/>
-        </w:numPr>
-        <w:spacing w:after="80"/>
-      </w:pPr>
-      <w:r>
-        <w:rPr>
-          <w:sz w:val="22"/>
-          <w:szCs w:val="22"/>
-        </w:rPr>
-        <w:t xml:space="preserve">Live Chat — real-time website chat support</w:t>
-      </w:r>
-    </w:p>
-    <w:p>
-      <w:pPr>
-        <w:pStyle w:val="ListParagraph"/>
-        <w:numPr>
-          <w:ilvl w:val="0"/>
-          <w:numId w:val="2"/>
-        </w:numPr>
-        <w:spacing w:after="80"/>
-      </w:pPr>
-      <w:r>
-        <w:rPr>
-          <w:sz w:val="22"/>
-          <w:szCs w:val="22"/>
-        </w:rPr>
-        <w:t xml:space="preserve">WhatsApp Business — messaging and customer service</w:t>
-      </w:r>
-    </w:p>
-    <w:p>
-      <w:pPr>
-        <w:pStyle w:val="ListParagraph"/>
-        <w:numPr>
-          <w:ilvl w:val="0"/>
-          <w:numId w:val="2"/>
-        </w:numPr>
-        <w:spacing w:after="80"/>
-      </w:pPr>
-      <w:r>
-        <w:rPr>
-          <w:sz w:val="22"/>
-          <w:szCs w:val="22"/>
-        </w:rPr>
-        <w:t xml:space="preserve">Facebook Messenger — page message management</w:t>
-      </w:r>
-    </w:p>
-    <w:p>
-      <w:pPr>
-        <w:pStyle w:val="ListParagraph"/>
-        <w:numPr>
-          <w:ilvl w:val="0"/>
-          <w:numId w:val="2"/>
-        </w:numPr>
-        <w:spacing w:after="80"/>
-      </w:pPr>
-      <w:r>
-        <w:rPr>
-          <w:sz w:val="22"/>
-          <w:szCs w:val="22"/>
-        </w:rPr>
-        <w:t xml:space="preserve">Instagram DMs — social customer service</w:t>
-      </w:r>
-    </w:p>
-    <w:p>
-      <w:pPr>
-        <w:pStyle w:val="ListParagraph"/>
-        <w:numPr>
-          <w:ilvl w:val="0"/>
-          <w:numId w:val="2"/>
-        </w:numPr>
-        <w:spacing w:after="80"/>
-      </w:pPr>
-      <w:r>
-        <w:rPr>
-          <w:sz w:val="22"/>
-          <w:szCs w:val="22"/>
-        </w:rPr>
-        <w:t xml:space="preserve">Twitter/X — mentions, DMs, and brand monitoring</w:t>
-      </w:r>
-    </w:p>
-    <w:p>
-      <w:pPr>
-        <w:pStyle w:val="ListParagraph"/>
-        <w:numPr>
-          <w:ilvl w:val="0"/>
-          <w:numId w:val="2"/>
-        </w:numPr>
-        <w:spacing w:after="80"/>
-      </w:pPr>
-      <w:r>
-        <w:rPr>
-          <w:sz w:val="22"/>
-          <w:szCs w:val="22"/>
-        </w:rPr>
-        <w:t xml:space="preserve">SMS — text-based customer communication</w:t>
-      </w:r>
-    </w:p>
-    <w:p>
-      <w:pPr>
-        <w:pStyle w:val="ListParagraph"/>
-        <w:numPr>
-          <w:ilvl w:val="0"/>
-          <w:numId w:val="2"/>
-        </w:numPr>
-        <w:spacing w:after="80"/>
-      </w:pPr>
-      <w:r>
-        <w:rPr>
-          <w:sz w:val="22"/>
-          <w:szCs w:val="22"/>
-        </w:rPr>
-        <w:t xml:space="preserve">Ticketing systems — Zendesk, Freshdesk, HubSpot, Intercom</w:t>
+        <w:t xml:space="preserve">Voice â€” inbound and outbound telephone support</w:t>
+      </w:r>
+    </w:p>
+    <w:p>
+      <w:pPr>
+        <w:pStyle w:val="ListParagraph"/>
+        <w:numPr>
+          <w:ilvl w:val="0"/>
+          <w:numId w:val="2"/>
+        </w:numPr>
+        <w:spacing w:after="80"/>
+      </w:pPr>
+      <w:r>
+        <w:rPr>
+          <w:sz w:val="22"/>
+          <w:szCs w:val="22"/>
+        </w:rPr>
+        <w:t xml:space="preserve">Email â€” inbox management and branded response handling</w:t>
+      </w:r>
+    </w:p>
+    <w:p>
+      <w:pPr>
+        <w:pStyle w:val="ListParagraph"/>
+        <w:numPr>
+          <w:ilvl w:val="0"/>
+          <w:numId w:val="2"/>
+        </w:numPr>
+        <w:spacing w:after="80"/>
+      </w:pPr>
+      <w:r>
+        <w:rPr>
+          <w:sz w:val="22"/>
+          <w:szCs w:val="22"/>
+        </w:rPr>
+        <w:t xml:space="preserve">Live Chat â€” real-time website chat support</w:t>
+      </w:r>
+    </w:p>
+    <w:p>
+      <w:pPr>
+        <w:pStyle w:val="ListParagraph"/>
+        <w:numPr>
+          <w:ilvl w:val="0"/>
+          <w:numId w:val="2"/>
+        </w:numPr>
+        <w:spacing w:after="80"/>
+      </w:pPr>
+      <w:r>
+        <w:rPr>
+          <w:sz w:val="22"/>
+          <w:szCs w:val="22"/>
+        </w:rPr>
+        <w:t xml:space="preserve">WhatsApp Business â€” messaging and customer service</w:t>
+      </w:r>
+    </w:p>
+    <w:p>
+      <w:pPr>
+        <w:pStyle w:val="ListParagraph"/>
+        <w:numPr>
+          <w:ilvl w:val="0"/>
+          <w:numId w:val="2"/>
+        </w:numPr>
+        <w:spacing w:after="80"/>
+      </w:pPr>
+      <w:r>
+        <w:rPr>
+          <w:sz w:val="22"/>
+          <w:szCs w:val="22"/>
+        </w:rPr>
+        <w:t xml:space="preserve">Facebook Messenger â€” page message management</w:t>
+      </w:r>
+    </w:p>
+    <w:p>
+      <w:pPr>
+        <w:pStyle w:val="ListParagraph"/>
+        <w:numPr>
+          <w:ilvl w:val="0"/>
+          <w:numId w:val="2"/>
+        </w:numPr>
+        <w:spacing w:after="80"/>
+      </w:pPr>
+      <w:r>
+        <w:rPr>
+          <w:sz w:val="22"/>
+          <w:szCs w:val="22"/>
+        </w:rPr>
+        <w:t xml:space="preserve">Instagram DMs â€” social customer service</w:t>
+      </w:r>
+    </w:p>
+    <w:p>
+      <w:pPr>
+        <w:pStyle w:val="ListParagraph"/>
+        <w:numPr>
+          <w:ilvl w:val="0"/>
+          <w:numId w:val="2"/>
+        </w:numPr>
+        <w:spacing w:after="80"/>
+      </w:pPr>
+      <w:r>
+        <w:rPr>
+          <w:sz w:val="22"/>
+          <w:szCs w:val="22"/>
+        </w:rPr>
+        <w:t xml:space="preserve">Twitter/X â€” mentions, DMs, and brand monitoring</w:t>
+      </w:r>
+    </w:p>
+    <w:p>
+      <w:pPr>
+        <w:pStyle w:val="ListParagraph"/>
+        <w:numPr>
+          <w:ilvl w:val="0"/>
+          <w:numId w:val="2"/>
+        </w:numPr>
+        <w:spacing w:after="80"/>
+      </w:pPr>
+      <w:r>
+        <w:rPr>
+          <w:sz w:val="22"/>
+          <w:szCs w:val="22"/>
+        </w:rPr>
+        <w:t xml:space="preserve">SMS â€” text-based customer communication</w:t>
+      </w:r>
+    </w:p>
+    <w:p>
+      <w:pPr>
+        <w:pStyle w:val="ListParagraph"/>
+        <w:numPr>
+          <w:ilvl w:val="0"/>
+          <w:numId w:val="2"/>
+        </w:numPr>
+        <w:spacing w:after="80"/>
+      </w:pPr>
+      <w:r>
+        <w:rPr>
+          <w:sz w:val="22"/>
+          <w:szCs w:val="22"/>
+        </w:rPr>
+        <w:t xml:space="preserve">Ticketing systems â€” Zendesk, Freshdesk, HubSpot, Intercom</w:t>
       </w:r>
     </w:p>
     <w:p>
@@ -3899,7 +3899,7 @@
           <w:sz w:val="28"/>
           <w:szCs w:val="28"/>
         </w:rPr>
-        <w:t xml:space="preserve">3.1 The Pioneer Advantage — Key Differentiators</w:t>
+        <w:t xml:space="preserve">3.1 The Pioneer Advantage â€” Key Differentiators</w:t>
       </w:r>
     </w:p>
     <w:p>
@@ -3935,7 +3935,7 @@
           <w:sz w:val="22"/>
           <w:szCs w:val="22"/>
         </w:rPr>
-        <w:t xml:space="preserve">The single most compelling reason clients partner with us. Hiring a full-time customer service agent in the USA costs $45,000–$65,000 per year in salary alone, before benefits, office space, equipment, recruitment fees, and training. Our clients access the same — or higher — quality of service at 40-60% of that cost. There are no hidden fees, no employment taxes, and no infrastructure costs on your end.</w:t>
+        <w:t xml:space="preserve">The single most compelling reason clients partner with us. Hiring a full-time customer service agent in the USA costs $45,000â€“$65,000 per year in salary alone, before benefits, office space, equipment, recruitment fees, and training. Our clients access the same â€” or higher â€” quality of service at 40-60% of that cost. There are no hidden fees, no employment taxes, and no infrastructure costs on your end.</w:t>
       </w:r>
     </w:p>
     <w:p>
@@ -3988,92 +3988,92 @@
           <w:sz w:val="22"/>
           <w:szCs w:val="22"/>
         </w:rPr>
-        <w:t xml:space="preserve">Highly educated workforce — Kenya has one of the highest university graduation rates in sub-Saharan Africa</w:t>
-      </w:r>
-    </w:p>
-    <w:p>
-      <w:pPr>
-        <w:pStyle w:val="ListParagraph"/>
-        <w:numPr>
-          <w:ilvl w:val="0"/>
-          <w:numId w:val="2"/>
-        </w:numPr>
-        <w:spacing w:after="80"/>
-      </w:pPr>
-      <w:r>
-        <w:rPr>
-          <w:sz w:val="22"/>
-          <w:szCs w:val="22"/>
-        </w:rPr>
-        <w:t xml:space="preserve">Native-level English fluency — English is an official language and the language of business and education</w:t>
-      </w:r>
-    </w:p>
-    <w:p>
-      <w:pPr>
-        <w:pStyle w:val="ListParagraph"/>
-        <w:numPr>
-          <w:ilvl w:val="0"/>
-          <w:numId w:val="2"/>
-        </w:numPr>
-        <w:spacing w:after="80"/>
-      </w:pPr>
-      <w:r>
-        <w:rPr>
-          <w:sz w:val="22"/>
-          <w:szCs w:val="22"/>
-        </w:rPr>
-        <w:t xml:space="preserve">Time zone UTC+3 — perfectly positioned for US overnight shifts and European daytime overlap</w:t>
-      </w:r>
-    </w:p>
-    <w:p>
-      <w:pPr>
-        <w:pStyle w:val="ListParagraph"/>
-        <w:numPr>
-          <w:ilvl w:val="0"/>
-          <w:numId w:val="2"/>
-        </w:numPr>
-        <w:spacing w:after="80"/>
-      </w:pPr>
-      <w:r>
-        <w:rPr>
-          <w:sz w:val="22"/>
-          <w:szCs w:val="22"/>
-        </w:rPr>
-        <w:t xml:space="preserve">Cultural affinity with Western markets — extensive exposure to US and UK media, business culture, and communication styles</w:t>
-      </w:r>
-    </w:p>
-    <w:p>
-      <w:pPr>
-        <w:pStyle w:val="ListParagraph"/>
-        <w:numPr>
-          <w:ilvl w:val="0"/>
-          <w:numId w:val="2"/>
-        </w:numPr>
-        <w:spacing w:after="80"/>
-      </w:pPr>
-      <w:r>
-        <w:rPr>
-          <w:sz w:val="22"/>
-          <w:szCs w:val="22"/>
-        </w:rPr>
-        <w:t xml:space="preserve">Strong telecommunications infrastructure — fibre internet, redundant power systems, modern office facilities</w:t>
-      </w:r>
-    </w:p>
-    <w:p>
-      <w:pPr>
-        <w:pStyle w:val="ListParagraph"/>
-        <w:numPr>
-          <w:ilvl w:val="0"/>
-          <w:numId w:val="2"/>
-        </w:numPr>
-        <w:spacing w:after="80"/>
-      </w:pPr>
-      <w:r>
-        <w:rPr>
-          <w:sz w:val="22"/>
-          <w:szCs w:val="22"/>
-        </w:rPr>
-        <w:t xml:space="preserve">Growing tech ecosystem — Nairobi is known as the "Silicon Savannah" of Africa</w:t>
+        <w:t xml:space="preserve">Highly educated workforce â€” Kenya has one of the highest university graduation rates in sub-Saharan Africa</w:t>
+      </w:r>
+    </w:p>
+    <w:p>
+      <w:pPr>
+        <w:pStyle w:val="ListParagraph"/>
+        <w:numPr>
+          <w:ilvl w:val="0"/>
+          <w:numId w:val="2"/>
+        </w:numPr>
+        <w:spacing w:after="80"/>
+      </w:pPr>
+      <w:r>
+        <w:rPr>
+          <w:sz w:val="22"/>
+          <w:szCs w:val="22"/>
+        </w:rPr>
+        <w:t xml:space="preserve">Native-level English fluency â€” English is an official language and the language of business and education</w:t>
+      </w:r>
+    </w:p>
+    <w:p>
+      <w:pPr>
+        <w:pStyle w:val="ListParagraph"/>
+        <w:numPr>
+          <w:ilvl w:val="0"/>
+          <w:numId w:val="2"/>
+        </w:numPr>
+        <w:spacing w:after="80"/>
+      </w:pPr>
+      <w:r>
+        <w:rPr>
+          <w:sz w:val="22"/>
+          <w:szCs w:val="22"/>
+        </w:rPr>
+        <w:t xml:space="preserve">Time zone UTC+3 â€” perfectly positioned for US overnight shifts and European daytime overlap</w:t>
+      </w:r>
+    </w:p>
+    <w:p>
+      <w:pPr>
+        <w:pStyle w:val="ListParagraph"/>
+        <w:numPr>
+          <w:ilvl w:val="0"/>
+          <w:numId w:val="2"/>
+        </w:numPr>
+        <w:spacing w:after="80"/>
+      </w:pPr>
+      <w:r>
+        <w:rPr>
+          <w:sz w:val="22"/>
+          <w:szCs w:val="22"/>
+        </w:rPr>
+        <w:t xml:space="preserve">Cultural affinity with Western markets â€” extensive exposure to US and UK media, business culture, and communication styles</w:t>
+      </w:r>
+    </w:p>
+    <w:p>
+      <w:pPr>
+        <w:pStyle w:val="ListParagraph"/>
+        <w:numPr>
+          <w:ilvl w:val="0"/>
+          <w:numId w:val="2"/>
+        </w:numPr>
+        <w:spacing w:after="80"/>
+      </w:pPr>
+      <w:r>
+        <w:rPr>
+          <w:sz w:val="22"/>
+          <w:szCs w:val="22"/>
+        </w:rPr>
+        <w:t xml:space="preserve">Strong telecommunications infrastructure â€” fibre internet, redundant power systems, modern office facilities</w:t>
+      </w:r>
+    </w:p>
+    <w:p>
+      <w:pPr>
+        <w:pStyle w:val="ListParagraph"/>
+        <w:numPr>
+          <w:ilvl w:val="0"/>
+          <w:numId w:val="2"/>
+        </w:numPr>
+        <w:spacing w:after="80"/>
+      </w:pPr>
+      <w:r>
+        <w:rPr>
+          <w:sz w:val="22"/>
+          <w:szCs w:val="22"/>
+        </w:rPr>
+        <w:t xml:space="preserve">Growing tech ecosystem â€” Nairobi is known as the "Silicon Savannah" of Africa</w:t>
       </w:r>
     </w:p>
     <w:p>
@@ -4305,7 +4305,7 @@
           <w:sz w:val="22"/>
           <w:szCs w:val="22"/>
         </w:rPr>
-        <w:t xml:space="preserve">Your business does not stay the same size — and neither should your support team. Pioneer allows you to scale agents up during peak seasons, product launches, or marketing campaigns, and scale back down when demand drops. No long-term hiring commitments, no severance costs, no HR headaches. We flex to your business cycle.</w:t>
+        <w:t xml:space="preserve">Your business does not stay the same size â€” and neither should your support team. Pioneer allows you to scale agents up during peak seasons, product launches, or marketing campaigns, and scale back down when demand drops. No long-term hiring commitments, no severance costs, no HR headaches. We flex to your business cycle.</w:t>
       </w:r>
     </w:p>
     <w:p>
@@ -4681,7 +4681,7 @@
           <w:sz w:val="22"/>
           <w:szCs w:val="22"/>
         </w:rPr>
-        <w:t xml:space="preserve">Contract length (monthly, quarterly, annual — longer = better rates)</w:t>
+        <w:t xml:space="preserve">Contract length (monthly, quarterly, annual â€” longer = better rates)</w:t>
       </w:r>
     </w:p>
     <w:p>
@@ -5078,7 +5078,7 @@
                 <w:sz w:val="20"/>
                 <w:szCs w:val="20"/>
               </w:rPr>
-              <w:t xml:space="preserve">2-week pilot available — ask about pilot pricing in your consultation.</w:t>
+              <w:t xml:space="preserve">2-week pilot available â€” ask about pilot pricing in your consultation.</w:t>
             </w:r>
           </w:p>
         </w:tc>
@@ -5403,7 +5403,7 @@
           <w:sz w:val="22"/>
           <w:szCs w:val="22"/>
         </w:rPr>
-        <w:t xml:space="preserve">Message us on WhatsApp: +254793008677</w:t>
+        <w:t xml:space="preserve">Message us on WhatsApp: +254 111 562 567</w:t>
       </w:r>
     </w:p>
     <w:p>
@@ -5494,7 +5494,7 @@
           <w:sz w:val="28"/>
           <w:szCs w:val="28"/>
         </w:rPr>
-        <w:t xml:space="preserve">Step 1 — Free Discovery Call (Day 1-2)</w:t>
+        <w:t xml:space="preserve">Step 1 â€” Free Discovery Call (Day 1-2)</w:t>
       </w:r>
     </w:p>
     <w:p>
@@ -5530,7 +5530,7 @@
           <w:sz w:val="28"/>
           <w:szCs w:val="28"/>
         </w:rPr>
-        <w:t xml:space="preserve">Step 2 — Custom Proposal (Day 2-4)</w:t>
+        <w:t xml:space="preserve">Step 2 â€” Custom Proposal (Day 2-4)</w:t>
       </w:r>
     </w:p>
     <w:p>
@@ -5566,7 +5566,7 @@
           <w:sz w:val="28"/>
           <w:szCs w:val="28"/>
         </w:rPr>
-        <w:t xml:space="preserve">Step 3 — Agreement &amp; NDA Signing (Day 4-5)</w:t>
+        <w:t xml:space="preserve">Step 3 â€” Agreement &amp; NDA Signing (Day 4-5)</w:t>
       </w:r>
     </w:p>
     <w:p>
@@ -5602,7 +5602,7 @@
           <w:sz w:val="28"/>
           <w:szCs w:val="28"/>
         </w:rPr>
-        <w:t xml:space="preserve">Step 4 — Agent Selection &amp; Matching (Day 5-8)</w:t>
+        <w:t xml:space="preserve">Step 4 â€” Agent Selection &amp; Matching (Day 5-8)</w:t>
       </w:r>
     </w:p>
     <w:p>
@@ -5638,7 +5638,7 @@
           <w:sz w:val="28"/>
           <w:szCs w:val="28"/>
         </w:rPr>
-        <w:t xml:space="preserve">Step 5 — Training &amp; Knowledge Transfer (Day 8-14)</w:t>
+        <w:t xml:space="preserve">Step 5 â€” Training &amp; Knowledge Transfer (Day 8-14)</w:t>
       </w:r>
     </w:p>
     <w:p>
@@ -5674,7 +5674,7 @@
           <w:sz w:val="28"/>
           <w:szCs w:val="28"/>
         </w:rPr>
-        <w:t xml:space="preserve">Step 6 — Soft Launch / Pilot (Day 14-28)</w:t>
+        <w:t xml:space="preserve">Step 6 â€” Soft Launch / Pilot (Day 14-28)</w:t>
       </w:r>
     </w:p>
     <w:p>
@@ -5710,7 +5710,7 @@
           <w:sz w:val="28"/>
           <w:szCs w:val="28"/>
         </w:rPr>
-        <w:t xml:space="preserve">Step 7 — Full Operations Go-Live</w:t>
+        <w:t xml:space="preserve">Step 7 â€” Full Operations Go-Live</w:t>
       </w:r>
     </w:p>
     <w:p>
@@ -6023,7 +6023,7 @@
                 <w:sz w:val="20"/>
                 <w:szCs w:val="20"/>
               </w:rPr>
-              <w:t xml:space="preserve">As agreed with client — typically 4-6 mins for standard calls</w:t>
+              <w:t xml:space="preserve">As agreed with client â€” typically 4-6 mins for standard calls</w:t>
             </w:r>
           </w:p>
         </w:tc>
@@ -6308,7 +6308,7 @@
                 <w:sz w:val="20"/>
                 <w:szCs w:val="20"/>
               </w:rPr>
-              <w:t xml:space="preserve">95%+ — backfill agents available same day</w:t>
+              <w:t xml:space="preserve">95%+ â€” backfill agents available same day</w:t>
             </w:r>
           </w:p>
         </w:tc>
@@ -6879,7 +6879,7 @@
           <w:sz w:val="22"/>
           <w:szCs w:val="22"/>
         </w:rPr>
-        <w:t xml:space="preserve">Access-controlled entry to all work areas — key cards and biometric where required</w:t>
+        <w:t xml:space="preserve">Access-controlled entry to all work areas â€” key cards and biometric where required</w:t>
       </w:r>
     </w:p>
     <w:p>
@@ -7005,7 +7005,7 @@
           <w:sz w:val="22"/>
           <w:szCs w:val="22"/>
         </w:rPr>
-        <w:t xml:space="preserve">Role-based access control — agents only see data they need to do their job</w:t>
+        <w:t xml:space="preserve">Role-based access control â€” agents only see data they need to do their job</w:t>
       </w:r>
     </w:p>
     <w:p>
@@ -7114,24 +7114,24 @@
           <w:sz w:val="22"/>
           <w:szCs w:val="22"/>
         </w:rPr>
-        <w:t xml:space="preserve">GDPR-ready — all processes designed for EU and UK data protection compliance</w:t>
-      </w:r>
-    </w:p>
-    <w:p>
-      <w:pPr>
-        <w:pStyle w:val="ListParagraph"/>
-        <w:numPr>
-          <w:ilvl w:val="0"/>
-          <w:numId w:val="2"/>
-        </w:numPr>
-        <w:spacing w:after="80"/>
-      </w:pPr>
-      <w:r>
-        <w:rPr>
-          <w:sz w:val="22"/>
-          <w:szCs w:val="22"/>
-        </w:rPr>
-        <w:t xml:space="preserve">CCPA-aware — processes support California Consumer Privacy Act requirements</w:t>
+        <w:t xml:space="preserve">GDPR-ready â€” all processes designed for EU and UK data protection compliance</w:t>
+      </w:r>
+    </w:p>
+    <w:p>
+      <w:pPr>
+        <w:pStyle w:val="ListParagraph"/>
+        <w:numPr>
+          <w:ilvl w:val="0"/>
+          <w:numId w:val="2"/>
+        </w:numPr>
+        <w:spacing w:after="80"/>
+      </w:pPr>
+      <w:r>
+        <w:rPr>
+          <w:sz w:val="22"/>
+          <w:szCs w:val="22"/>
+        </w:rPr>
+        <w:t xml:space="preserve">CCPA-aware â€” processes support California Consumer Privacy Act requirements</w:t>
       </w:r>
     </w:p>
     <w:p>
@@ -7274,7 +7274,7 @@
           <w:sz w:val="22"/>
           <w:szCs w:val="22"/>
         </w:rPr>
-        <w:t xml:space="preserve">IP protection clauses — all work product belongs to the client</w:t>
+        <w:t xml:space="preserve">IP protection clauses â€” all work product belongs to the client</w:t>
       </w:r>
     </w:p>
     <w:p>
@@ -8317,7 +8317,7 @@
           <w:sz w:val="22"/>
           <w:szCs w:val="22"/>
         </w:rPr>
-        <w:t xml:space="preserve">A: Pricing is customised based on your specific requirements — number of agents, service type, hours of coverage, skill level, and contract length. We do not quote a price before understanding your needs. After a free discovery call, we deliver a detailed proposal within 24-48 hours.</w:t>
+        <w:t xml:space="preserve">A: Pricing is customised based on your specific requirements â€” number of agents, service type, hours of coverage, skill level, and contract length. We do not quote a price before understanding your needs. After a free discovery call, we deliver a detailed proposal within 24-48 hours.</w:t>
       </w:r>
     </w:p>
     <w:p>
@@ -8371,7 +8371,7 @@
           <w:sz w:val="22"/>
           <w:szCs w:val="22"/>
         </w:rPr>
-        <w:t xml:space="preserve">A: For standard engagements, there are no separate setup fees — onboarding and training are included in the monthly service fee. For very large or highly complex setups requiring extensive custom development, a one-time setup fee may apply and will be disclosed upfront.</w:t>
+        <w:t xml:space="preserve">A: For standard engagements, there are no separate setup fees â€” onboarding and training are included in the monthly service fee. For very large or highly complex setups requiring extensive custom development, a one-time setup fee may apply and will be disclosed upfront.</w:t>
       </w:r>
     </w:p>
     <w:p>
@@ -8716,7 +8716,7 @@
           <w:sz w:val="22"/>
           <w:szCs w:val="22"/>
         </w:rPr>
-        <w:t xml:space="preserve">A: Yes. We work with clients to set up secure access protocols — VPNs, role-based access, and two-factor authentication where required. Agents are trained on your specific security policies.</w:t>
+        <w:t xml:space="preserve">A: Yes. We work with clients to set up secure access protocols â€” VPNs, role-based access, and two-factor authentication where required. Agents are trained on your specific security policies.</w:t>
       </w:r>
     </w:p>
     <w:p>
@@ -8821,7 +8821,7 @@
           <w:sz w:val="22"/>
           <w:szCs w:val="22"/>
         </w:rPr>
-        <w:t xml:space="preserve">A: Strong English communication skills (spoken and written), computer literacy, professional attitude, reliability, and a genuine customer service orientation. BPO experience is an advantage but not always required — we invest in training the right people.</w:t>
+        <w:t xml:space="preserve">A: Strong English communication skills (spoken and written), computer literacy, professional attitude, reliability, and a genuine customer service orientation. BPO experience is an advantage but not always required â€” we invest in training the right people.</w:t>
       </w:r>
     </w:p>
     <w:p>
@@ -8966,7 +8966,7 @@
           <w:sz w:val="22"/>
           <w:szCs w:val="22"/>
         </w:rPr>
-        <w:t xml:space="preserve">Response: We completely understand cost is a key consideration. However, our clients typically save 40-60% compared to hiring locally. When you factor in salary, benefits, employer taxes, office space, equipment, and recruitment costs, a local hire in the US or UK often costs 2-3x what you pay with us. Our pricing is all-inclusive — there are no hidden costs. Would you like us to prepare a cost comparison for your specific needs?</w:t>
+        <w:t xml:space="preserve">Response: We completely understand cost is a key consideration. However, our clients typically save 40-60% compared to hiring locally. When you factor in salary, benefits, employer taxes, office space, equipment, and recruitment costs, a local hire in the US or UK often costs 2-3x what you pay with us. Our pricing is all-inclusive â€” there are no hidden costs. Would you like us to prepare a cost comparison for your specific needs?</w:t>
       </w:r>
     </w:p>
     <w:p>
@@ -9002,7 +9002,7 @@
           <w:sz w:val="22"/>
           <w:szCs w:val="22"/>
         </w:rPr>
-        <w:t xml:space="preserve">Response: This is a very common concern before clients work with us — and it's one that disappears very quickly once they do. Kenya has one of the highest educated, English-fluent workforces in Africa. Our agents are university graduates who have been trained specifically for international business. We currently maintain a 98% client satisfaction rate across 200+ global clients. We'd love to set up a pilot so you can judge the quality firsthand — no long-term commitment required.</w:t>
+        <w:t xml:space="preserve">Response: This is a very common concern before clients work with us â€” and it's one that disappears very quickly once they do. Kenya has one of the highest educated, English-fluent workforces in Africa. Our agents are university graduates who have been trained specifically for international business. We currently maintain a 98% client satisfaction rate across 200+ global clients. We'd love to set up a pilot so you can judge the quality firsthand â€” no long-term commitment required.</w:t>
       </w:r>
     </w:p>
     <w:p>
@@ -9038,7 +9038,7 @@
           <w:sz w:val="22"/>
           <w:szCs w:val="22"/>
         </w:rPr>
-        <w:t xml:space="preserve">Response: We hear this often, and we take it seriously. Bad outsourcing experiences usually come from poor agent matching, weak onboarding, and a lack of ongoing quality control. Our approach is different — we take time to truly understand your business, handpick agents for your account, run a structured training programme, and have a dedicated account manager monitoring quality every week. We'd be happy to share case studies and client references so you can hear directly from businesses like yours.</w:t>
+        <w:t xml:space="preserve">Response: We hear this often, and we take it seriously. Bad outsourcing experiences usually come from poor agent matching, weak onboarding, and a lack of ongoing quality control. Our approach is different â€” we take time to truly understand your business, handpick agents for your account, run a structured training programme, and have a dedicated account manager monitoring quality every week. We'd be happy to share case studies and client references so you can hear directly from businesses like yours.</w:t>
       </w:r>
     </w:p>
     <w:p>
@@ -9074,7 +9074,7 @@
           <w:sz w:val="22"/>
           <w:szCs w:val="22"/>
         </w:rPr>
-        <w:t xml:space="preserve">Response: That's completely fine. There's no pressure to start immediately. Many of our clients took time to think it through before coming back to us. What I can do is send you some resources about how our onboarding works, and you can reach out when the timing is right. Alternatively, a free consultation costs nothing and you might find it helpful for planning ahead — even if you're 3-6 months away from being ready.</w:t>
+        <w:t xml:space="preserve">Response: That's completely fine. There's no pressure to start immediately. Many of our clients took time to think it through before coming back to us. What I can do is send you some resources about how our onboarding works, and you can reach out when the timing is right. Alternatively, a free consultation costs nothing and you might find it helpful for planning ahead â€” even if you're 3-6 months away from being ready.</w:t>
       </w:r>
     </w:p>
     <w:p>
@@ -9110,7 +9110,7 @@
           <w:sz w:val="22"/>
           <w:szCs w:val="22"/>
         </w:rPr>
-        <w:t xml:space="preserve">Response: That's a valid preference, and outsourcing is not right for every function. Many of our clients actually keep their core team in-house and use us for overflow support, after-hours coverage, or specific functions like data entry or lead generation. This hybrid approach gives them the best of both worlds — the control of an in-house team with the flexibility and cost savings of outsourcing. Would that kind of arrangement be interesting to explore?</w:t>
+        <w:t xml:space="preserve">Response: That's a valid preference, and outsourcing is not right for every function. Many of our clients actually keep their core team in-house and use us for overflow support, after-hours coverage, or specific functions like data entry or lead generation. This hybrid approach gives them the best of both worlds â€” the control of an in-house team with the flexibility and cost savings of outsourcing. Would that kind of arrangement be interesting to explore?</w:t>
       </w:r>
     </w:p>
     <w:p>
@@ -9146,7 +9146,7 @@
           <w:sz w:val="22"/>
           <w:szCs w:val="22"/>
         </w:rPr>
-        <w:t xml:space="preserve">Response: Absolutely, take the time you need. Can I ask — is there any specific concern or question I can answer right now that might help you move forward? Sometimes a quick call or a detailed proposal answers the key questions and makes the decision much clearer. I'm happy to send over a no-obligation proposal based on your needs so you have something concrete to review.</w:t>
+        <w:t xml:space="preserve">Response: Absolutely, take the time you need. Can I ask â€” is there any specific concern or question I can answer right now that might help you move forward? Sometimes a quick call or a detailed proposal answers the key questions and makes the decision much clearer. I'm happy to send over a no-obligation proposal based on your needs so you have something concrete to review.</w:t>
       </w:r>
     </w:p>
     <w:p>
@@ -9239,7 +9239,7 @@
           <w:sz w:val="22"/>
           <w:szCs w:val="22"/>
         </w:rPr>
-        <w:t xml:space="preserve">WhatsApp: +254793008677</w:t>
+        <w:t xml:space="preserve">WhatsApp: +254 111 562 567</w:t>
       </w:r>
     </w:p>
     <w:p>
@@ -9653,7 +9653,7 @@
                 <w:sz w:val="20"/>
                 <w:szCs w:val="20"/>
               </w:rPr>
-              <w:t xml:space="preserve">Email hello@pioneeroutsourcingbpo.com with subject: COMPLAINT — Immediate response</w:t>
+              <w:t xml:space="preserve">Email hello@pioneeroutsourcingbpo.com with subject: COMPLAINT â€” Immediate response</w:t>
             </w:r>
           </w:p>
         </w:tc>
@@ -9771,7 +9771,7 @@
           <w:sz w:val="22"/>
           <w:szCs w:val="22"/>
         </w:rPr>
-        <w:t xml:space="preserve">Never quote specific prices — invite the visitor to request a custom quote</w:t>
+        <w:t xml:space="preserve">Never quote specific prices â€” invite the visitor to request a custom quote</w:t>
       </w:r>
     </w:p>
     <w:p>
@@ -9920,7 +9920,7 @@
           <w:sz w:val="20"/>
           <w:szCs w:val="20"/>
         </w:rPr>
-        <w:t xml:space="preserve">hello@pioneeroutsourcingbpo.com  |  +254793008677</w:t>
+        <w:t xml:space="preserve">hello@pioneeroutsourcingbpo.com  |  +254 111 562 567</w:t>
       </w:r>
     </w:p>
     <w:sectPr>
@@ -10156,7 +10156,7 @@
     <w:lvl w:ilvl="0" w15:tentative="1">
       <w:start w:val="1"/>
       <w:numFmt w:val="bullet"/>
-      <w:lvlText w:val="•"/>
+      <w:lvlText w:val="â€¢"/>
       <w:lvlJc w:val="left"/>
       <w:pPr>
         <w:ind w:left="720" w:hanging="360"/>

</xml_diff>